<commit_message>
docs: explain the Interlock name in the brief itself
The title was insider vocabulary from railway signalling and machine
guarding, and a reader who has to look it up has already stopped
reading. Adds a one-sentence gloss under the byline giving the everyday
version: the mechanism that physically prevents an unsafe action from
being carried out, like a microwave door switch.

Fitting it in the one-page Word brief needed roughly four lines back, so
the section 01 list, the open-architecture and L3 rows and the reference
line are all a little terser.

Co-Authored-By: Claude Opus 5 <noreply@anthropic.com>
Claude-Session: https://claude.ai/code/session_01L2VSKhEzucwVMfqfmUvEZi
</commit_message>
<xml_diff>
--- a/_grant-drafts/Interlock-Brief.docx
+++ b/_grant-drafts/Interlock-Brief.docx
@@ -66,10 +66,37 @@
     </w:p>
     <w:p>
       <w:pPr>
+        <w:spacing w:after="38" w:line="182"/>
+        <w:jc w:val="both"/>
+      </w:pPr>
+      <w:r>
+        <w:rPr>
+          <w:rFonts w:ascii="Consolas" w:cs="Consolas" w:eastAsia="Consolas" w:hAnsi="Consolas"/>
+          <w:b/>
+          <w:bCs/>
+          <w:color w:val="44701B"/>
+          <w:spacing w:val="10"/>
+          <w:sz w:val="11"/>
+          <w:szCs w:val="11"/>
+        </w:rPr>
+        <w:t xml:space="preserve">THE NAME   </w:t>
+      </w:r>
+      <w:r>
+        <w:rPr>
+          <w:rFonts w:ascii="Cambria" w:cs="Cambria" w:eastAsia="Cambria" w:hAnsi="Cambria"/>
+          <w:color w:val="5A645A"/>
+          <w:sz w:val="14"/>
+          <w:szCs w:val="14"/>
+        </w:rPr>
+        <w:t xml:space="preserve">Interlock is the safety-engineering term for a mechanism that physically prevents an unsafe action from being carried out, like the switch that cuts the microwave the moment its door opens: this project builds that for a robot taking instructions from a language model.</w:t>
+      </w:r>
+    </w:p>
+    <w:p>
+      <w:pPr>
         <w:pBdr>
           <w:left w:val="single" w:color="44701B" w:sz="16" w:space="9"/>
         </w:pBdr>
-        <w:spacing w:after="34" w:before="34" w:line="198"/>
+        <w:spacing w:after="30" w:before="30" w:line="198"/>
         <w:ind w:left="150" w:right="40"/>
         <w:jc w:val="both"/>
       </w:pPr>
@@ -86,7 +113,7 @@
     <w:p>
       <w:pPr>
         <w:keepNext/>
-        <w:spacing w:after="24" w:before="56"/>
+        <w:spacing w:after="22" w:before="50"/>
       </w:pPr>
       <w:r>
         <w:rPr>
@@ -125,13 +152,13 @@
           <w:sz w:val="16"/>
           <w:szCs w:val="16"/>
         </w:rPr>
-        <w:t xml:space="preserve">NVIDIA has spent 2026 making the case from every direction: Nemotron 3 with published weights and reproducible recipes, the Nemotron Coalition, a joint engine with Palantir for air-gapped sovereign deployment, Isaac GR00T N1.7 with an open reference humanoid, and the training corpora themselves. Every operator that vendors its own weights buys its own accelerators. It stalls in physical AI: a sovereign operator can host a model but cannot certify a robot around it. Assurance, not model quality, gates deployment in mining, agriculture, defence and orbital servicing, and nobody has built the stack that converts openness into that argument.</w:t>
+        <w:t xml:space="preserve">NVIDIA has spent 2026 making the case from every direction: Nemotron 3 with published weights and recipes, the Nemotron Coalition, a Palantir engine for air-gapped sovereign deployment, Isaac GR00T N1.7 with an open reference humanoid, and the corpora themselves. Every operator that vendors its own weights buys its own accelerators. It stalls in physical AI: a sovereign operator can host a model but cannot certify a robot around it. Assurance, not model quality, gates deployment in mining, agriculture, defence and orbital servicing, and nobody has built the stack that converts openness into that argument.</w:t>
       </w:r>
     </w:p>
     <w:p>
       <w:pPr>
         <w:keepNext/>
-        <w:spacing w:after="24" w:before="56"/>
+        <w:spacing w:after="22" w:before="50"/>
       </w:pPr>
       <w:r>
         <w:rPr>
@@ -369,7 +396,7 @@
                 <w:sz w:val="14"/>
                 <w:szCs w:val="14"/>
               </w:rPr>
-              <w:t xml:space="preserve"> batch-invariant inference means replacing the RMSNorm, matmul and attention kernels, which cannot be done inside a graph you cannot see. The same access decides which layer a probe reads, whether a TensorRT engine can be built, and whether the model can be audited for a backdoor at all. Weights without architecture are an inert blob.</w:t>
+              <w:t xml:space="preserve"> batch-invariant inference means replacing the RMSNorm, matmul and attention kernels, which cannot be done inside a graph you cannot see. It also decides which layer a probe reads, whether a TensorRT engine can be built, and whether a backdoor can be audited at all. Weights without architecture are an inert blob.</w:t>
             </w:r>
           </w:p>
         </w:tc>
@@ -490,7 +517,7 @@
     <w:p>
       <w:pPr>
         <w:keepNext/>
-        <w:spacing w:after="24" w:before="56"/>
+        <w:spacing w:after="22" w:before="50"/>
       </w:pPr>
       <w:r>
         <w:rPr>
@@ -529,7 +556,7 @@
           <w:sz w:val="16"/>
           <w:szCs w:val="16"/>
         </w:rPr>
-        <w:t xml:space="preserve">Longitudinal tracking of commercial APIs (HAPI) found substantial behaviour change over time in the majority observed, inside unchanged version strings. A 2026 benchmark finds that fine-tuning-style updates frequently invalidate frozen activation probes while quantisation-style updates largely do not, and on a closed endpoint you cannot tell which kind landed. Pin the three axes and every safety artifact gains a stable referent and an explicit revalidation trigger. Batch-invariant kernels then buy bitwise-reproducible inference for 34% to 60% of throughput. </w:t>
+        <w:t xml:space="preserve">Longitudinal tracking of commercial APIs (HAPI) found substantial behaviour change in the majority observed, inside unchanged version strings. A 2026 benchmark finds that fine-tuning-style updates frequently invalidate frozen activation probes while quantisation-style updates largely do not, and on a closed endpoint you cannot tell which kind landed. Pin the three axes and every safety artifact gains a stable referent and an explicit revalidation trigger. Batch-invariant kernels then buy bitwise-reproducible inference for 34% to 60% of throughput. </w:t>
       </w:r>
       <w:r>
         <w:rPr>
@@ -546,7 +573,7 @@
     <w:p>
       <w:pPr>
         <w:keepNext/>
-        <w:spacing w:after="24" w:before="56"/>
+        <w:spacing w:after="22" w:before="50"/>
       </w:pPr>
       <w:r>
         <w:rPr>
@@ -1089,7 +1116,7 @@
                 <w:sz w:val="14"/>
                 <w:szCs w:val="14"/>
               </w:rPr>
-              <w:t xml:space="preserve">Conformal prediction over real token scores gives distribution-free coverage and a principled trigger to ask a human or escalate. This needs logits, which open weights give and most endpoints withhold. A small pinned model holds the edge loop; a large one is reachable for slow reasoning.</w:t>
+              <w:t xml:space="preserve">Conformal prediction over real token scores gives distribution-free coverage and a principled trigger to ask a human or escalate. This needs logits, which open weights give and most endpoints withhold, and it decides when a small pinned edge model hands off to a large one.</w:t>
             </w:r>
           </w:p>
         </w:tc>
@@ -1132,7 +1159,7 @@
     <w:p>
       <w:pPr>
         <w:keepNext/>
-        <w:spacing w:after="24" w:before="56"/>
+        <w:spacing w:after="22" w:before="50"/>
       </w:pPr>
       <w:r>
         <w:rPr>
@@ -1292,7 +1319,7 @@
     <w:p>
       <w:pPr>
         <w:keepNext/>
-        <w:spacing w:after="24" w:before="56"/>
+        <w:spacing w:after="22" w:before="50"/>
       </w:pPr>
       <w:r>
         <w:rPr>
@@ -1337,7 +1364,7 @@
     <w:p>
       <w:pPr>
         <w:keepNext/>
-        <w:spacing w:after="24" w:before="56"/>
+        <w:spacing w:after="22" w:before="50"/>
       </w:pPr>
       <w:r>
         <w:rPr>
@@ -1433,7 +1460,7 @@
         <w:pBdr>
           <w:top w:val="single" w:color="C9CFC2" w:sz="6" w:space="4"/>
         </w:pBdr>
-        <w:spacing w:after="0" w:before="30" w:line="155"/>
+        <w:spacing w:after="0" w:before="20" w:line="152"/>
         <w:jc w:val="both"/>
       </w:pPr>
       <w:r>
@@ -1443,12 +1470,12 @@
           <w:sz w:val="11"/>
           <w:szCs w:val="11"/>
         </w:rPr>
-        <w:t xml:space="preserve">SOURCES   [1] Nguyen, IEEE RA-L 10(8), 2025.   [2] RoboGuard, arXiv:2503.07885.   [3] KnowNo, CoRL 2023.   [4] XGrammar; alignment tax, arXiv:2604.06066.   [5] Thinking Machines, Defeating Nondeterminism, 2025.   [6] Activation-monitor staleness, arXiv:2606.15980.   [7] HAPI API-drift dataset.   [8] Safety Chip, ICRA 2024; simplex after Sha, 2001.   Data: nvidia/Nemotron-Pretraining-*, nvidia/PhysicalAI-Robotics-*.</w:t>
+        <w:t xml:space="preserve">SOURCES   Nguyen, IEEE RA-L 10(8), 2025 · RoboGuard, arXiv:2503.07885 · KnowNo, CoRL 2023 · XGrammar; alignment tax, arXiv:2604.06066 · Thinking Machines, Defeating Nondeterminism, 2025 · Activation-monitor staleness, arXiv:2606.15980 · HAPI API-drift dataset · Safety Chip, ICRA 2024; simplex after Sha, 2001 · Data: nvidia/Nemotron-Pretraining-*, nvidia/PhysicalAI-Robotics-*.</w:t>
       </w:r>
     </w:p>
     <w:sectPr>
       <w:pgSz w:w="11906" w:h="16838" w:orient="portrait"/>
-      <w:pgMar w:top="420" w:right="640" w:bottom="340" w:left="640" w:header="708" w:footer="708" w:gutter="0"/>
+      <w:pgMar w:top="420" w:right="640" w:bottom="300" w:left="640" w:header="708" w:footer="708" w:gutter="0"/>
       <w:pgNumType/>
       <w:docGrid w:linePitch="360"/>
     </w:sectPr>

</xml_diff>